<commit_message>
update framing worksheet (revised version)
</commit_message>
<xml_diff>
--- a/assets/worksheets/framing-worksheet.docx
+++ b/assets/worksheets/framing-worksheet.docx
@@ -2,15 +2,74 @@
 <file path=word/document.xml><?xml version="1.0" encoding="utf-8"?>
 <w:document xmlns:wpc="http://schemas.microsoft.com/office/word/2010/wordprocessingCanvas" xmlns:cx="http://schemas.microsoft.com/office/drawing/2014/chartex" xmlns:cx1="http://schemas.microsoft.com/office/drawing/2015/9/8/chartex" xmlns:cx2="http://schemas.microsoft.com/office/drawing/2015/10/21/chartex" xmlns:cx3="http://schemas.microsoft.com/office/drawing/2016/5/9/chartex" xmlns:cx4="http://schemas.microsoft.com/office/drawing/2016/5/10/chartex" xmlns:cx5="http://schemas.microsoft.com/office/drawing/2016/5/11/chartex" xmlns:cx6="http://schemas.microsoft.com/office/drawing/2016/5/12/chartex" xmlns:cx7="http://schemas.microsoft.com/office/drawing/2016/5/13/chartex" xmlns:cx8="http://schemas.microsoft.com/office/drawing/2016/5/14/chartex" xmlns:mc="http://schemas.openxmlformats.org/markup-compatibility/2006" xmlns:aink="http://schemas.microsoft.com/office/drawing/2016/ink" xmlns:am3d="http://schemas.microsoft.com/office/drawing/2017/model3d" xmlns:o="urn:schemas-microsoft-com:office:office" xmlns:oel="http://schemas.microsoft.com/office/2019/extlst" xmlns:r="http://schemas.openxmlformats.org/officeDocument/2006/relationships" xmlns:m="http://schemas.openxmlformats.org/officeDocument/2006/math" xmlns:v="urn:schemas-microsoft-com:vml" xmlns:wp14="http://schemas.microsoft.com/office/word/2010/wordprocessingDrawing" xmlns:wp="http://schemas.openxmlformats.org/drawingml/2006/wordprocessingDrawing" xmlns:w10="urn:schemas-microsoft-com:office:word" xmlns:w="http://schemas.openxmlformats.org/wordprocessingml/2006/main" xmlns:w14="http://schemas.microsoft.com/office/word/2010/wordml" xmlns:w15="http://schemas.microsoft.com/office/word/2012/wordml" xmlns:w16cex="http://schemas.microsoft.com/office/word/2018/wordml/cex" xmlns:w16cid="http://schemas.microsoft.com/office/word/2016/wordml/cid" xmlns:w16="http://schemas.microsoft.com/office/word/2018/wordml" xmlns:w16du="http://schemas.microsoft.com/office/word/2023/wordml/word16du" xmlns:w16sdtdh="http://schemas.microsoft.com/office/word/2020/wordml/sdtdatahash" xmlns:w16sdtfl="http://schemas.microsoft.com/office/word/2024/wordml/sdtformatlock" xmlns:w16se="http://schemas.microsoft.com/office/word/2015/wordml/symex" xmlns:wpg="http://schemas.microsoft.com/office/word/2010/wordprocessingGroup" xmlns:wpi="http://schemas.microsoft.com/office/word/2010/wordprocessingInk" xmlns:wne="http://schemas.microsoft.com/office/word/2006/wordml" xmlns:wps="http://schemas.microsoft.com/office/word/2010/wordprocessingShape" mc:Ignorable="w14 w15 w16se w16cid w16 w16cex w16sdtdh w16sdtfl w16du wp14">
   <w:body>
+    <w:p/>
+    <w:p/>
     <w:p>
       <w:pPr>
-        <w:pStyle w:val="Heading1"/>
-        <w:spacing w:after="240"/>
+        <w:jc w:val="center"/>
+        <w:rPr>
+          <w:b/>
+          <w:bCs/>
+          <w:sz w:val="32"/>
+          <w:szCs w:val="32"/>
+        </w:rPr>
       </w:pPr>
       <w:r>
         <w:rPr>
           <w:b/>
           <w:bCs/>
+          <w:sz w:val="32"/>
+          <w:szCs w:val="32"/>
+        </w:rPr>
+        <w:t xml:space="preserve">The Problem Framing </w:t>
+      </w:r>
+      <w:r>
+        <w:rPr>
+          <w:b/>
+          <w:bCs/>
+          <w:sz w:val="32"/>
+          <w:szCs w:val="32"/>
+        </w:rPr>
+        <w:t>Works</w:t>
+      </w:r>
+      <w:r>
+        <w:rPr>
+          <w:b/>
+          <w:bCs/>
+          <w:sz w:val="32"/>
+          <w:szCs w:val="32"/>
+        </w:rPr>
+        <w:t>heet</w:t>
+      </w:r>
+    </w:p>
+    <w:p/>
+    <w:p>
+      <w:r>
+        <w:t xml:space="preserve">This </w:t>
+      </w:r>
+      <w:r>
+        <w:t>work</w:t>
+      </w:r>
+      <w:r>
+        <w:t>sheet is designed to be used during a presentation on any problem setting where there is a goal to improve a product or process in some way.  Do not try to prioritize these elements; the goal is to simply identify them as they are revealed during the presentation.</w:t>
+      </w:r>
+    </w:p>
+    <w:p>
+      <w:pPr>
+        <w:pStyle w:val="Heading1"/>
+        <w:rPr>
+          <w:b/>
+          <w:bCs/>
+          <w:color w:val="000000"/>
+        </w:rPr>
+      </w:pPr>
+    </w:p>
+    <w:p>
+      <w:pPr>
+        <w:pStyle w:val="Heading1"/>
+      </w:pPr>
+      <w:r>
+        <w:rPr>
           <w:color w:val="000000"/>
         </w:rPr>
         <w:t>Performance metrics</w:t>
@@ -39,12 +98,6 @@
         <w:gridCol w:w="4680"/>
       </w:tblGrid>
       <w:tr>
-        <w:tblPrEx>
-          <w:tblCellMar>
-            <w:top w:w="0" w:type="dxa"/>
-            <w:bottom w:w="0" w:type="dxa"/>
-          </w:tblCellMar>
-        </w:tblPrEx>
         <w:tc>
           <w:tcPr>
             <w:tcW w:w="4680" w:type="dxa"/>
@@ -101,12 +154,6 @@
         </w:tc>
       </w:tr>
       <w:tr>
-        <w:tblPrEx>
-          <w:tblCellMar>
-            <w:top w:w="0" w:type="dxa"/>
-            <w:bottom w:w="0" w:type="dxa"/>
-          </w:tblCellMar>
-        </w:tblPrEx>
         <w:tc>
           <w:tcPr>
             <w:tcW w:w="4680" w:type="dxa"/>
@@ -163,12 +210,6 @@
         </w:tc>
       </w:tr>
       <w:tr>
-        <w:tblPrEx>
-          <w:tblCellMar>
-            <w:top w:w="0" w:type="dxa"/>
-            <w:bottom w:w="0" w:type="dxa"/>
-          </w:tblCellMar>
-        </w:tblPrEx>
         <w:tc>
           <w:tcPr>
             <w:tcW w:w="4680" w:type="dxa"/>
@@ -225,12 +266,6 @@
         </w:tc>
       </w:tr>
       <w:tr>
-        <w:tblPrEx>
-          <w:tblCellMar>
-            <w:top w:w="0" w:type="dxa"/>
-            <w:bottom w:w="0" w:type="dxa"/>
-          </w:tblCellMar>
-        </w:tblPrEx>
         <w:tc>
           <w:tcPr>
             <w:tcW w:w="4680" w:type="dxa"/>
@@ -287,74 +322,6 @@
         </w:tc>
       </w:tr>
       <w:tr>
-        <w:tblPrEx>
-          <w:tblCellMar>
-            <w:top w:w="0" w:type="dxa"/>
-            <w:bottom w:w="0" w:type="dxa"/>
-          </w:tblCellMar>
-        </w:tblPrEx>
-        <w:tc>
-          <w:tcPr>
-            <w:tcW w:w="4680" w:type="dxa"/>
-            <w:tcBorders>
-              <w:top w:val="none" w:sz="0" w:space="0" w:color="FFFFFF"/>
-              <w:left w:val="none" w:sz="0" w:space="0" w:color="FFFFFF"/>
-              <w:bottom w:val="single" w:sz="6" w:space="0" w:color="000000"/>
-              <w:right w:val="none" w:sz="0" w:space="0" w:color="FFFFFF"/>
-            </w:tcBorders>
-            <w:tcMar>
-              <w:top w:w="150" w:type="dxa"/>
-              <w:left w:w="60" w:type="dxa"/>
-              <w:bottom w:w="150" w:type="dxa"/>
-              <w:right w:w="60" w:type="dxa"/>
-            </w:tcMar>
-          </w:tcPr>
-          <w:p/>
-        </w:tc>
-        <w:tc>
-          <w:tcPr>
-            <w:tcW w:w="720" w:type="dxa"/>
-            <w:tcBorders>
-              <w:top w:val="none" w:sz="0" w:space="0" w:color="FFFFFF"/>
-              <w:left w:val="none" w:sz="0" w:space="0" w:color="FFFFFF"/>
-              <w:bottom w:val="none" w:sz="0" w:space="0" w:color="FFFFFF"/>
-              <w:right w:val="none" w:sz="0" w:space="0" w:color="FFFFFF"/>
-            </w:tcBorders>
-            <w:tcMar>
-              <w:top w:w="150" w:type="dxa"/>
-              <w:left w:w="0" w:type="dxa"/>
-              <w:bottom w:w="150" w:type="dxa"/>
-              <w:right w:w="0" w:type="dxa"/>
-            </w:tcMar>
-          </w:tcPr>
-          <w:p/>
-        </w:tc>
-        <w:tc>
-          <w:tcPr>
-            <w:tcW w:w="4680" w:type="dxa"/>
-            <w:tcBorders>
-              <w:top w:val="none" w:sz="0" w:space="0" w:color="FFFFFF"/>
-              <w:left w:val="none" w:sz="0" w:space="0" w:color="FFFFFF"/>
-              <w:bottom w:val="single" w:sz="6" w:space="0" w:color="000000"/>
-              <w:right w:val="none" w:sz="0" w:space="0" w:color="FFFFFF"/>
-            </w:tcBorders>
-            <w:tcMar>
-              <w:top w:w="150" w:type="dxa"/>
-              <w:left w:w="60" w:type="dxa"/>
-              <w:bottom w:w="150" w:type="dxa"/>
-              <w:right w:w="60" w:type="dxa"/>
-            </w:tcMar>
-          </w:tcPr>
-          <w:p/>
-        </w:tc>
-      </w:tr>
-      <w:tr>
-        <w:tblPrEx>
-          <w:tblCellMar>
-            <w:top w:w="0" w:type="dxa"/>
-            <w:bottom w:w="0" w:type="dxa"/>
-          </w:tblCellMar>
-        </w:tblPrEx>
         <w:tc>
           <w:tcPr>
             <w:tcW w:w="4680" w:type="dxa"/>
@@ -425,12 +392,9 @@
     <w:p>
       <w:pPr>
         <w:pStyle w:val="Heading1"/>
-        <w:spacing w:after="240"/>
       </w:pPr>
       <w:r>
         <w:rPr>
-          <w:b/>
-          <w:bCs/>
           <w:color w:val="000000"/>
         </w:rPr>
         <w:t>Types of decisions</w:t>
@@ -459,12 +423,6 @@
         <w:gridCol w:w="4680"/>
       </w:tblGrid>
       <w:tr>
-        <w:tblPrEx>
-          <w:tblCellMar>
-            <w:top w:w="0" w:type="dxa"/>
-            <w:bottom w:w="0" w:type="dxa"/>
-          </w:tblCellMar>
-        </w:tblPrEx>
         <w:tc>
           <w:tcPr>
             <w:tcW w:w="4680" w:type="dxa"/>
@@ -521,12 +479,6 @@
         </w:tc>
       </w:tr>
       <w:tr>
-        <w:tblPrEx>
-          <w:tblCellMar>
-            <w:top w:w="0" w:type="dxa"/>
-            <w:bottom w:w="0" w:type="dxa"/>
-          </w:tblCellMar>
-        </w:tblPrEx>
         <w:tc>
           <w:tcPr>
             <w:tcW w:w="4680" w:type="dxa"/>
@@ -583,12 +535,6 @@
         </w:tc>
       </w:tr>
       <w:tr>
-        <w:tblPrEx>
-          <w:tblCellMar>
-            <w:top w:w="0" w:type="dxa"/>
-            <w:bottom w:w="0" w:type="dxa"/>
-          </w:tblCellMar>
-        </w:tblPrEx>
         <w:tc>
           <w:tcPr>
             <w:tcW w:w="4680" w:type="dxa"/>
@@ -645,12 +591,6 @@
         </w:tc>
       </w:tr>
       <w:tr>
-        <w:tblPrEx>
-          <w:tblCellMar>
-            <w:top w:w="0" w:type="dxa"/>
-            <w:bottom w:w="0" w:type="dxa"/>
-          </w:tblCellMar>
-        </w:tblPrEx>
         <w:tc>
           <w:tcPr>
             <w:tcW w:w="4680" w:type="dxa"/>
@@ -707,74 +647,6 @@
         </w:tc>
       </w:tr>
       <w:tr>
-        <w:tblPrEx>
-          <w:tblCellMar>
-            <w:top w:w="0" w:type="dxa"/>
-            <w:bottom w:w="0" w:type="dxa"/>
-          </w:tblCellMar>
-        </w:tblPrEx>
-        <w:tc>
-          <w:tcPr>
-            <w:tcW w:w="4680" w:type="dxa"/>
-            <w:tcBorders>
-              <w:top w:val="none" w:sz="0" w:space="0" w:color="FFFFFF"/>
-              <w:left w:val="none" w:sz="0" w:space="0" w:color="FFFFFF"/>
-              <w:bottom w:val="single" w:sz="6" w:space="0" w:color="000000"/>
-              <w:right w:val="none" w:sz="0" w:space="0" w:color="FFFFFF"/>
-            </w:tcBorders>
-            <w:tcMar>
-              <w:top w:w="150" w:type="dxa"/>
-              <w:left w:w="60" w:type="dxa"/>
-              <w:bottom w:w="150" w:type="dxa"/>
-              <w:right w:w="60" w:type="dxa"/>
-            </w:tcMar>
-          </w:tcPr>
-          <w:p/>
-        </w:tc>
-        <w:tc>
-          <w:tcPr>
-            <w:tcW w:w="720" w:type="dxa"/>
-            <w:tcBorders>
-              <w:top w:val="none" w:sz="0" w:space="0" w:color="FFFFFF"/>
-              <w:left w:val="none" w:sz="0" w:space="0" w:color="FFFFFF"/>
-              <w:bottom w:val="none" w:sz="0" w:space="0" w:color="FFFFFF"/>
-              <w:right w:val="none" w:sz="0" w:space="0" w:color="FFFFFF"/>
-            </w:tcBorders>
-            <w:tcMar>
-              <w:top w:w="150" w:type="dxa"/>
-              <w:left w:w="0" w:type="dxa"/>
-              <w:bottom w:w="150" w:type="dxa"/>
-              <w:right w:w="0" w:type="dxa"/>
-            </w:tcMar>
-          </w:tcPr>
-          <w:p/>
-        </w:tc>
-        <w:tc>
-          <w:tcPr>
-            <w:tcW w:w="4680" w:type="dxa"/>
-            <w:tcBorders>
-              <w:top w:val="none" w:sz="0" w:space="0" w:color="FFFFFF"/>
-              <w:left w:val="none" w:sz="0" w:space="0" w:color="FFFFFF"/>
-              <w:bottom w:val="single" w:sz="6" w:space="0" w:color="000000"/>
-              <w:right w:val="none" w:sz="0" w:space="0" w:color="FFFFFF"/>
-            </w:tcBorders>
-            <w:tcMar>
-              <w:top w:w="150" w:type="dxa"/>
-              <w:left w:w="60" w:type="dxa"/>
-              <w:bottom w:w="150" w:type="dxa"/>
-              <w:right w:w="60" w:type="dxa"/>
-            </w:tcMar>
-          </w:tcPr>
-          <w:p/>
-        </w:tc>
-      </w:tr>
-      <w:tr>
-        <w:tblPrEx>
-          <w:tblCellMar>
-            <w:top w:w="0" w:type="dxa"/>
-            <w:bottom w:w="0" w:type="dxa"/>
-          </w:tblCellMar>
-        </w:tblPrEx>
         <w:tc>
           <w:tcPr>
             <w:tcW w:w="4680" w:type="dxa"/>
@@ -834,7 +706,6 @@
     <w:p>
       <w:pPr>
         <w:pStyle w:val="Heading1"/>
-        <w:spacing w:after="240"/>
         <w:rPr>
           <w:b/>
           <w:bCs/>
@@ -845,12 +716,9 @@
     <w:p>
       <w:pPr>
         <w:pStyle w:val="Heading1"/>
-        <w:spacing w:after="240"/>
       </w:pPr>
       <w:r>
         <w:rPr>
-          <w:b/>
-          <w:bCs/>
           <w:color w:val="000000"/>
         </w:rPr>
         <w:t>Forms of uncertainty</w:t>
@@ -879,12 +747,6 @@
         <w:gridCol w:w="4680"/>
       </w:tblGrid>
       <w:tr>
-        <w:tblPrEx>
-          <w:tblCellMar>
-            <w:top w:w="0" w:type="dxa"/>
-            <w:bottom w:w="0" w:type="dxa"/>
-          </w:tblCellMar>
-        </w:tblPrEx>
         <w:tc>
           <w:tcPr>
             <w:tcW w:w="4680" w:type="dxa"/>
@@ -941,12 +803,6 @@
         </w:tc>
       </w:tr>
       <w:tr>
-        <w:tblPrEx>
-          <w:tblCellMar>
-            <w:top w:w="0" w:type="dxa"/>
-            <w:bottom w:w="0" w:type="dxa"/>
-          </w:tblCellMar>
-        </w:tblPrEx>
         <w:tc>
           <w:tcPr>
             <w:tcW w:w="4680" w:type="dxa"/>
@@ -1003,12 +859,6 @@
         </w:tc>
       </w:tr>
       <w:tr>
-        <w:tblPrEx>
-          <w:tblCellMar>
-            <w:top w:w="0" w:type="dxa"/>
-            <w:bottom w:w="0" w:type="dxa"/>
-          </w:tblCellMar>
-        </w:tblPrEx>
         <w:tc>
           <w:tcPr>
             <w:tcW w:w="4680" w:type="dxa"/>
@@ -1065,12 +915,6 @@
         </w:tc>
       </w:tr>
       <w:tr>
-        <w:tblPrEx>
-          <w:tblCellMar>
-            <w:top w:w="0" w:type="dxa"/>
-            <w:bottom w:w="0" w:type="dxa"/>
-          </w:tblCellMar>
-        </w:tblPrEx>
         <w:tc>
           <w:tcPr>
             <w:tcW w:w="4680" w:type="dxa"/>
@@ -1127,74 +971,6 @@
         </w:tc>
       </w:tr>
       <w:tr>
-        <w:tblPrEx>
-          <w:tblCellMar>
-            <w:top w:w="0" w:type="dxa"/>
-            <w:bottom w:w="0" w:type="dxa"/>
-          </w:tblCellMar>
-        </w:tblPrEx>
-        <w:tc>
-          <w:tcPr>
-            <w:tcW w:w="4680" w:type="dxa"/>
-            <w:tcBorders>
-              <w:top w:val="none" w:sz="0" w:space="0" w:color="FFFFFF"/>
-              <w:left w:val="none" w:sz="0" w:space="0" w:color="FFFFFF"/>
-              <w:bottom w:val="single" w:sz="6" w:space="0" w:color="000000"/>
-              <w:right w:val="none" w:sz="0" w:space="0" w:color="FFFFFF"/>
-            </w:tcBorders>
-            <w:tcMar>
-              <w:top w:w="150" w:type="dxa"/>
-              <w:left w:w="60" w:type="dxa"/>
-              <w:bottom w:w="150" w:type="dxa"/>
-              <w:right w:w="60" w:type="dxa"/>
-            </w:tcMar>
-          </w:tcPr>
-          <w:p/>
-        </w:tc>
-        <w:tc>
-          <w:tcPr>
-            <w:tcW w:w="720" w:type="dxa"/>
-            <w:tcBorders>
-              <w:top w:val="none" w:sz="0" w:space="0" w:color="FFFFFF"/>
-              <w:left w:val="none" w:sz="0" w:space="0" w:color="FFFFFF"/>
-              <w:bottom w:val="none" w:sz="0" w:space="0" w:color="FFFFFF"/>
-              <w:right w:val="none" w:sz="0" w:space="0" w:color="FFFFFF"/>
-            </w:tcBorders>
-            <w:tcMar>
-              <w:top w:w="150" w:type="dxa"/>
-              <w:left w:w="0" w:type="dxa"/>
-              <w:bottom w:w="150" w:type="dxa"/>
-              <w:right w:w="0" w:type="dxa"/>
-            </w:tcMar>
-          </w:tcPr>
-          <w:p/>
-        </w:tc>
-        <w:tc>
-          <w:tcPr>
-            <w:tcW w:w="4680" w:type="dxa"/>
-            <w:tcBorders>
-              <w:top w:val="none" w:sz="0" w:space="0" w:color="FFFFFF"/>
-              <w:left w:val="none" w:sz="0" w:space="0" w:color="FFFFFF"/>
-              <w:bottom w:val="single" w:sz="6" w:space="0" w:color="000000"/>
-              <w:right w:val="none" w:sz="0" w:space="0" w:color="FFFFFF"/>
-            </w:tcBorders>
-            <w:tcMar>
-              <w:top w:w="150" w:type="dxa"/>
-              <w:left w:w="60" w:type="dxa"/>
-              <w:bottom w:w="150" w:type="dxa"/>
-              <w:right w:w="60" w:type="dxa"/>
-            </w:tcMar>
-          </w:tcPr>
-          <w:p/>
-        </w:tc>
-      </w:tr>
-      <w:tr>
-        <w:tblPrEx>
-          <w:tblCellMar>
-            <w:top w:w="0" w:type="dxa"/>
-            <w:bottom w:w="0" w:type="dxa"/>
-          </w:tblCellMar>
-        </w:tblPrEx>
         <w:tc>
           <w:tcPr>
             <w:tcW w:w="4680" w:type="dxa"/>
@@ -1306,7 +1082,7 @@
   <w:p>
     <w:pPr>
       <w:pStyle w:val="Header"/>
-      <w:ind w:left="5400"/>
+      <w:ind w:left="4860"/>
       <w:rPr>
         <w:u w:val="single"/>
       </w:rPr>

</xml_diff>